<commit_message>
Adoucit la formulation de l'annexe IA
</commit_message>
<xml_diff>
--- a/06_livrable/rapport_ci1_leroux_final_humanise.docx
+++ b/06_livrable/rapport_ci1_leroux_final_humanise.docx
@@ -7818,7 +7818,7 @@
           <w:color w:val="000000"/>
           <w:sz w:val="22"/>
         </w:rPr>
-        <w:t>Les outils d'intelligence artificielle utilisés dans le cadre de ce rapport sont ChatGPT et Codex.</w:t>
+        <w:t>J'ai utilisé ChatGPT et Codex comme aides ponctuelles pendant la préparation de ce rapport.</w:t>
       </w:r>
     </w:p>
     <w:p>
@@ -7854,7 +7854,7 @@
           <w:color w:val="000000"/>
           <w:sz w:val="22"/>
         </w:rPr>
-        <w:t xml:space="preserve">Ces outils ont été utilisés comme aide à la structuration du rapport, à la rédaction de certains passages, à la reformulation, à la relecture et au contrôle qualité. Ils ont aussi servi à préparer des prompts de travail dans Codex, à vérifier la cohérence entre les parties du rapport et à repérer les passages qui demandaient une formulation plus précise ou plus mesurée.</w:t>
+        <w:t>Je m'en suis surtout servi comme appui de relecture et de formulation : clarifier certaines idées, améliorer quelques phrases, vérifier que les parties restaient cohérentes et repérer les passages trop vagues. Ces outils n'ont pas servi à inventer des missions, des résultats ou des informations qui ne viennent pas de mon expérience.</w:t>
       </w:r>
     </w:p>
     <w:p>
@@ -7890,7 +7890,7 @@
           <w:color w:val="000000"/>
           <w:sz w:val="22"/>
         </w:rPr>
-        <w:t xml:space="preserve">L'IA n'a pas réalisé seule le rapport. Elle a servi d'outil d'assistance pour proposer des formulations, organiser les idées, améliorer la clarté du texte et repérer certaines incohérences ou répétitions. Le tri, les corrections, les choix de contenu et la validation finale sont restés de ma responsabilité.</w:t>
+        <w:t>Le rapport reste basé sur mes missions, mes notes et les éléments validés dans le projet. Quand une proposition générée ne correspondait pas à mon vécu ou au niveau de détail autorisé, je l'ai corrigée ou supprimée. Le tri, les choix de contenu, la relecture et la validation finale sont donc restés de ma responsabilité.</w:t>
       </w:r>
     </w:p>
     <w:p>
@@ -7926,7 +7926,7 @@
           <w:color w:val="000000"/>
           <w:sz w:val="22"/>
         </w:rPr>
-        <w:t xml:space="preserve">L'usage de l'IA a concerné principalement la structuration générale du rapport, la reformulation de certains passages déjà rédigés, la préparation de certaines sections, l'annexe IA elle-même et les vérifications de cohérence entre le plan, les missions, le bilan personnel, la conclusion et les sources.</w:t>
+        <w:t>L'aide a surtout concerné la structure générale, quelques reformulations, l'annexe IA et des vérifications de cohérence entre le plan, les missions, le bilan personnel, la conclusion et les sources. Les parties techniques et les exemples sont restés limités aux informations réellement disponibles.</w:t>
       </w:r>
     </w:p>
     <w:p>
@@ -7962,7 +7962,7 @@
           <w:color w:val="000000"/>
           <w:sz w:val="22"/>
         </w:rPr>
-        <w:t xml:space="preserve">L'utilisation de l'IA a été faite de manière raisonnée. Je l'ai limitée aux besoins utiles pour structurer, relire ou améliorer le rapport, afin d'éviter les générations inutiles. Je ne dispose pas d'une mesure carbone précise pour cet usage, mais je retiens que ces outils ont un impact environnemental et qu'ils doivent être utilisés avec sobriété.</w:t>
+        <w:t>J'ai essayé d'utiliser ces outils avec mesure, principalement quand un passage devait être clarifié ou relu. Je ne dispose pas d'une mesure carbone précise pour cet usage, mais je garde en tête que ces outils ont un impact environnemental. C'est aussi pour cette raison que je les ai utilisés comme appui, et non comme remplacement de mon travail de rédaction et de validation.</w:t>
       </w:r>
     </w:p>
     <w:p>

</xml_diff>